<commit_message>
docs(a1): Week-4 plan — move DRO characterization from Role 1 to Role 3 (rebalance; R1=5, R3=5)
</commit_message>
<xml_diff>
--- a/A1_deliverables/A1_Week4_NextRoles.docx
+++ b/A1_deliverables/A1_Week4_NextRoles.docx
@@ -173,45 +173,6 @@
           <w:b/>
           <w:bCs/>
         </w:rPr>
-        <w:t xml:space="preserve">Give the distributionally-robust characterization.</w:t>
-      </w:r>
-      <w:r>
-        <w:t xml:space="preserve"> </w:t>
-      </w:r>
-      <w:r>
-        <w:t xml:space="preserve">Combine the functional with an</w:t>
-      </w:r>
-      <w:r>
-        <w:t xml:space="preserve"> </w:t>
-      </w:r>
-      <w:r>
-        <w:t xml:space="preserve">ambiguity set of demand laws: characterize the worst-case distribution and the</w:t>
-      </w:r>
-      <w:r>
-        <w:t xml:space="preserve"> </w:t>
-      </w:r>
-      <w:r>
-        <w:t xml:space="preserve">robust-optimal contract in terms of the functional, with a closed form on the power-law</w:t>
-      </w:r>
-      <w:r>
-        <w:t xml:space="preserve"> </w:t>
-      </w:r>
-      <w:r>
-        <w:t xml:space="preserve">family and a price of robustness.</w:t>
-      </w:r>
-    </w:p>
-    <w:p>
-      <w:pPr>
-        <w:numPr>
-          <w:ilvl w:val="0"/>
-          <w:numId w:val="1001"/>
-        </w:numPr>
-      </w:pPr>
-      <w:r>
-        <w:rPr>
-          <w:b/>
-          <w:bCs/>
-        </w:rPr>
         <w:t xml:space="preserve">Draw the carbon phase diagram from the functional.</w:t>
       </w:r>
       <w:r>
@@ -584,6 +545,51 @@
       </w:r>
       <w:r>
         <w:t xml:space="preserve">near the boundary where surplus-only ceases to be globally optimal.</w:t>
+      </w:r>
+    </w:p>
+    <w:p>
+      <w:pPr>
+        <w:numPr>
+          <w:ilvl w:val="0"/>
+          <w:numId w:val="1003"/>
+        </w:numPr>
+      </w:pPr>
+      <w:r>
+        <w:rPr>
+          <w:b/>
+          <w:bCs/>
+        </w:rPr>
+        <w:t xml:space="preserve">Give the distributionally-robust characterization.</w:t>
+      </w:r>
+      <w:r>
+        <w:t xml:space="preserve"> </w:t>
+      </w:r>
+      <w:r>
+        <w:t xml:space="preserve">Combine Role 1’s functional with</w:t>
+      </w:r>
+      <w:r>
+        <w:t xml:space="preserve"> </w:t>
+      </w:r>
+      <w:r>
+        <w:t xml:space="preserve">an ambiguity set of demand laws: characterize the worst-case distribution and the</w:t>
+      </w:r>
+      <w:r>
+        <w:t xml:space="preserve"> </w:t>
+      </w:r>
+      <w:r>
+        <w:t xml:space="preserve">robust-optimal contract in terms of the functional, with a closed form on the power-law</w:t>
+      </w:r>
+      <w:r>
+        <w:t xml:space="preserve"> </w:t>
+      </w:r>
+      <w:r>
+        <w:t xml:space="preserve">family and a price of robustness – the robustness capstone that turns the</w:t>
+      </w:r>
+      <w:r>
+        <w:t xml:space="preserve"> </w:t>
+      </w:r>
+      <w:r>
+        <w:t xml:space="preserve">shape-independent guarantee into a proved worst-case optimum.</w:t>
       </w:r>
     </w:p>
     <w:bookmarkEnd w:id="11"/>

</xml_diff>